<commit_message>
docs: removed section and reordered report
</commit_message>
<xml_diff>
--- a/Freight_Rate_Assessment_Report.docx
+++ b/Freight_Rate_Assessment_Report.docx
@@ -36,6 +36,11 @@
       <w:pPr>
         <w:pStyle w:val="2"/>
         <w:spacing w:before="300" w:after="150"/>
+        <w:rPr>
+          <w:rFonts w:hint="default"/>
+          <w:vertAlign w:val="subscript"/>
+          <w:lang w:val="en-US"/>
+        </w:rPr>
       </w:pPr>
       <w:r>
         <w:t>1. Data Exploration &amp; Key Findings</w:t>
@@ -177,11 +182,63 @@
     </w:p>
     <w:p>
       <w:pPr>
+        <w:pStyle w:val="16"/>
+        <w:numPr>
+          <w:numId w:val="0"/>
+        </w:numPr>
+        <w:spacing w:after="80"/>
+      </w:pPr>
+    </w:p>
+    <w:p>
+      <w:pPr>
+        <w:pStyle w:val="16"/>
+        <w:numPr>
+          <w:numId w:val="0"/>
+        </w:numPr>
+        <w:spacing w:after="80"/>
+      </w:pPr>
+    </w:p>
+    <w:p>
+      <w:pPr>
+        <w:pStyle w:val="16"/>
+        <w:numPr>
+          <w:numId w:val="0"/>
+        </w:numPr>
+        <w:spacing w:after="80"/>
+      </w:pPr>
+    </w:p>
+    <w:p>
+      <w:pPr>
+        <w:pStyle w:val="16"/>
+        <w:numPr>
+          <w:numId w:val="0"/>
+        </w:numPr>
+        <w:spacing w:after="80"/>
+      </w:pPr>
+    </w:p>
+    <w:p>
+      <w:pPr>
+        <w:pStyle w:val="16"/>
+        <w:numPr>
+          <w:numId w:val="0"/>
+        </w:numPr>
+        <w:spacing w:after="80"/>
+      </w:pPr>
+    </w:p>
+    <w:p>
+      <w:pPr>
         <w:pStyle w:val="2"/>
         <w:spacing w:before="300" w:after="150"/>
       </w:pPr>
       <w:r>
-        <w:t>3. A Leakage Bug I Found and Fixed</w:t>
+        <w:rPr>
+          <w:rFonts w:hint="default"/>
+          <w:lang w:val="en-US"/>
+        </w:rPr>
+        <w:t>3</w:t>
+      </w:r>
+      <w:r>
+        <w:t>. Validation Strategy</w:t>
       </w:r>
     </w:p>
     <w:p>
@@ -189,15 +246,46 @@
         <w:spacing w:after="140"/>
       </w:pPr>
       <w:r>
-        <w:t>While building the pipeline, I initially computed the missing-value medians once, from the full train_test.csv, before splitting into a fit/holdout period for evaluation. That meant the holdout period's own values were contributing to the median used to fill gaps in the training portion — a subtle form of information leaking backward from the 'future' into training preparation.</w:t>
-      </w:r>
-    </w:p>
-    <w:p>
-      <w:pPr>
-        <w:spacing w:after="140"/>
-      </w:pPr>
-      <w:r>
-        <w:t>I caught this by comparing the median computed from only the pre-cutoff months against the median from the full dataset — they differed slightly (market_index: 1.12 vs ≈1.05), confirming the leak was real, not just theoretical. I fixed it so that during evaluation, medians and city-effect encodings are computed strictly from the fit period and only ever applied forward to the holdout period — never the reverse. The full-dataset versions are only used afterward, for the final model that generates the actual submission predictions, once evaluation is complete and there's no more leakage risk.</w:t>
+        <w:t>This is fundamentally a forecasting problem — the model must predict rates one to two months beyond the last training date. A random split would let the model 'see' data from around a future period and overstate accuracy. Instead:</w:t>
+      </w:r>
+    </w:p>
+    <w:p>
+      <w:pPr>
+        <w:pStyle w:val="16"/>
+        <w:numPr>
+          <w:ilvl w:val="0"/>
+          <w:numId w:val="1"/>
+        </w:numPr>
+        <w:spacing w:after="80"/>
+      </w:pPr>
+      <w:r>
+        <w:t>Primary evaluation: trained on Jan 1 – Aug 31, held out Sep 1 – Oct 31 (~9,523 rows) as a proxy for the real Nov/Dec forecast gap.</w:t>
+      </w:r>
+    </w:p>
+    <w:p>
+      <w:pPr>
+        <w:pStyle w:val="16"/>
+        <w:numPr>
+          <w:ilvl w:val="0"/>
+          <w:numId w:val="1"/>
+        </w:numPr>
+        <w:spacing w:after="80"/>
+      </w:pPr>
+      <w:r>
+        <w:t>Hyperparameter tuning used 3 rolling time-based folds (holdouts of Sep–Oct, Jul–Aug, and May–Jun) rather than a single split, so chosen hyperparameters aren't overfit to one particular window.</w:t>
+      </w:r>
+    </w:p>
+    <w:p>
+      <w:pPr>
+        <w:pStyle w:val="16"/>
+        <w:numPr>
+          <w:ilvl w:val="0"/>
+          <w:numId w:val="1"/>
+        </w:numPr>
+        <w:spacing w:after="80"/>
+      </w:pPr>
+      <w:r>
+        <w:t>Final model: retrained on all 10 months (Jan–Oct) before predicting validation.csv (Nov–Dec) and the December chart scenario, to use all available history for the actual deliverable.</w:t>
       </w:r>
     </w:p>
     <w:p>
@@ -206,7 +294,14 @@
         <w:spacing w:before="300" w:after="150"/>
       </w:pPr>
       <w:r>
-        <w:t>4. Validation Strategy</w:t>
+        <w:rPr>
+          <w:rFonts w:hint="default"/>
+          <w:lang w:val="en-US"/>
+        </w:rPr>
+        <w:t>4</w:t>
+      </w:r>
+      <w:r>
+        <w:t>. A Leakage Bug I Found and Fixed</w:t>
       </w:r>
     </w:p>
     <w:p>
@@ -214,47 +309,25 @@
         <w:spacing w:after="140"/>
       </w:pPr>
       <w:r>
-        <w:t>This is fundamentally a forecasting problem — the model must predict rates one to two months beyond the last training date. A random split would let the model 'see' data from around a future period and overstate accuracy. Instead:</w:t>
-      </w:r>
-    </w:p>
-    <w:p>
-      <w:pPr>
-        <w:pStyle w:val="16"/>
-        <w:numPr>
-          <w:ilvl w:val="0"/>
-          <w:numId w:val="1"/>
-        </w:numPr>
-        <w:spacing w:after="80"/>
-      </w:pPr>
-      <w:r>
-        <w:t>Primary evaluation: trained on Jan 1 – Aug 31, held out Sep 1 – Oct 31 (~9,523 rows) as a proxy for the real Nov/Dec forecast gap.</w:t>
-      </w:r>
-    </w:p>
-    <w:p>
-      <w:pPr>
-        <w:pStyle w:val="16"/>
-        <w:numPr>
-          <w:ilvl w:val="0"/>
-          <w:numId w:val="1"/>
-        </w:numPr>
-        <w:spacing w:after="80"/>
-      </w:pPr>
-      <w:r>
-        <w:t>Hyperparameter tuning used 3 rolling time-based folds (holdouts of Sep–Oct, Jul–Aug, and May–Jun) rather than a single split, so chosen hyperparameters aren't overfit to one particular window.</w:t>
-      </w:r>
-    </w:p>
-    <w:p>
-      <w:pPr>
-        <w:pStyle w:val="16"/>
-        <w:numPr>
-          <w:ilvl w:val="0"/>
-          <w:numId w:val="1"/>
-        </w:numPr>
-        <w:spacing w:after="80"/>
-      </w:pPr>
-      <w:r>
-        <w:t>Final model: retrained on all 10 months (Jan–Oct) before predicting validation.csv (Nov–Dec) and the December chart scenario, to use all available history for the actual deliverable.</w:t>
-      </w:r>
+        <w:t>While building the pipeline, I initially computed the missing-value medians once, from the full train_test.csv, before splitting into a fit/holdout period for evaluation. That meant the holdout period's own values were contributing to the median used to fill gaps in the training portion — a subtle form of information leaking backward from the 'future' into training preparation.</w:t>
+      </w:r>
+    </w:p>
+    <w:p>
+      <w:pPr>
+        <w:spacing w:after="140"/>
+      </w:pPr>
+      <w:r>
+        <w:t>I caught this by comparing the median computed from only the pre-cutoff months against the median from the full dataset — they differed slightly (market_index: 1.12 vs ≈1.05), confirming the leak was real, not just theoretical. I fixed it so that during evaluation, medians and city-effect encodings are computed strictly from the fit period and only ever applied forward to the holdout period — never the reverse. The full-dataset versions are only used afterward, for the final model that generates the actual submission predictions, once evaluation is complete and there's no more leakage risk.</w:t>
+      </w:r>
+    </w:p>
+    <w:p>
+      <w:pPr>
+        <w:pStyle w:val="16"/>
+        <w:numPr>
+          <w:numId w:val="0"/>
+        </w:numPr>
+        <w:spacing w:after="80"/>
+      </w:pPr>
     </w:p>
     <w:p>
       <w:pPr>
@@ -654,6 +727,10 @@
     <w:p>
       <w:pPr>
         <w:spacing w:after="140"/>
+        <w:rPr>
+          <w:i/>
+          <w:iCs/>
+        </w:rPr>
       </w:pPr>
       <w:r>
         <w:rPr>
@@ -662,6 +739,33 @@
         </w:rPr>
         <w:t>Top features by gain: distance dominates overwhelmingly (as expected, given the 0.91 correlation), followed by quote_signal, pickup/delivery longitude, and equipment — with pickup_effect, doy_cos, and delivery_effect contributing smaller but real amounts, confirming the engineered features add genuine signal beyond the raw inputs.</w:t>
       </w:r>
+    </w:p>
+    <w:p>
+      <w:pPr>
+        <w:spacing w:after="140"/>
+        <w:rPr>
+          <w:i/>
+          <w:iCs/>
+        </w:rPr>
+      </w:pPr>
+    </w:p>
+    <w:p>
+      <w:pPr>
+        <w:spacing w:after="140"/>
+        <w:rPr>
+          <w:i/>
+          <w:iCs/>
+        </w:rPr>
+      </w:pPr>
+    </w:p>
+    <w:p>
+      <w:pPr>
+        <w:spacing w:after="140"/>
+        <w:rPr>
+          <w:i/>
+          <w:iCs/>
+        </w:rPr>
+      </w:pPr>
     </w:p>
     <w:p>
       <w:pPr>
@@ -738,53 +842,14 @@
     </w:p>
     <w:p>
       <w:pPr>
-        <w:pStyle w:val="2"/>
-        <w:spacing w:before="300" w:after="150"/>
-      </w:pPr>
-      <w:r>
-        <w:t>7. What I'd Do With More Time</w:t>
-      </w:r>
+        <w:pStyle w:val="16"/>
+        <w:numPr>
+          <w:numId w:val="0"/>
+        </w:numPr>
+        <w:spacing w:after="80"/>
+      </w:pPr>
       <w:bookmarkStart w:id="0" w:name="_GoBack"/>
       <w:bookmarkEnd w:id="0"/>
-    </w:p>
-    <w:p>
-      <w:pPr>
-        <w:pStyle w:val="16"/>
-        <w:numPr>
-          <w:ilvl w:val="0"/>
-          <w:numId w:val="1"/>
-        </w:numPr>
-        <w:spacing w:after="80"/>
-      </w:pPr>
-      <w:r>
-        <w:t>Rebuild lane-effect encodings and medians fully per-fold during hyperparameter search (the tuning stage reused full-data statistics across folds for speed — a reasonable approximation for comparing relative hyperparameter performance, but not fully leak-free in absolute terms; the final reported metric uses the clean single split, not the tuning folds).</w:t>
-      </w:r>
-    </w:p>
-    <w:p>
-      <w:pPr>
-        <w:pStyle w:val="16"/>
-        <w:numPr>
-          <w:ilvl w:val="0"/>
-          <w:numId w:val="1"/>
-        </w:numPr>
-        <w:spacing w:after="80"/>
-      </w:pPr>
-      <w:r>
-        <w:t>Quantile predictions (e.g. 10th/90th percentile) alongside the point forecast, useful for a pricing/bidding use case.</w:t>
-      </w:r>
-    </w:p>
-    <w:p>
-      <w:pPr>
-        <w:pStyle w:val="16"/>
-        <w:numPr>
-          <w:ilvl w:val="0"/>
-          <w:numId w:val="1"/>
-        </w:numPr>
-        <w:spacing w:after="80"/>
-      </w:pPr>
-      <w:r>
-        <w:t>Investigate whether the 8 unseen validation cities have region/state metadata that could make the lane-effect fallback more precise than pure geographic nearest-neighbors.</w:t>
-      </w:r>
     </w:p>
     <w:sectPr>
       <w:pgSz w:w="12240" w:h="15840"/>
@@ -946,8 +1011,8 @@
     <w:lsdException w:unhideWhenUsed="0" w:uiPriority="0" w:semiHidden="0" w:name="annotation reference"/>
     <w:lsdException w:unhideWhenUsed="0" w:uiPriority="0" w:semiHidden="0" w:name="line number"/>
     <w:lsdException w:unhideWhenUsed="0" w:uiPriority="0" w:semiHidden="0" w:name="page number"/>
-    <w:lsdException w:uiPriority="99" w:name="endnote reference"/>
-    <w:lsdException w:uiPriority="99" w:name="endnote text"/>
+    <w:lsdException w:qFormat="1" w:uiPriority="99" w:name="endnote reference"/>
+    <w:lsdException w:qFormat="1" w:uiPriority="99" w:name="endnote text"/>
     <w:lsdException w:unhideWhenUsed="0" w:uiPriority="0" w:semiHidden="0" w:name="table of authorities"/>
     <w:lsdException w:unhideWhenUsed="0" w:uiPriority="0" w:semiHidden="0" w:name="macro"/>
     <w:lsdException w:unhideWhenUsed="0" w:uiPriority="0" w:semiHidden="0" w:name="toa heading"/>
@@ -1159,6 +1224,7 @@
     <w:qFormat/>
     <w:uiPriority w:val="0"/>
     <w:rPr>
+      <w:rFonts w:asciiTheme="minorHAnsi" w:hAnsiTheme="minorHAnsi" w:eastAsiaTheme="minorEastAsia" w:cstheme="minorBidi"/>
       <w:sz w:val="21"/>
       <w:szCs w:val="22"/>
     </w:rPr>
@@ -1169,6 +1235,7 @@
     <w:qFormat/>
     <w:uiPriority w:val="0"/>
     <w:rPr>
+      <w:rFonts w:asciiTheme="minorHAnsi" w:hAnsiTheme="minorHAnsi" w:eastAsiaTheme="minorEastAsia" w:cstheme="minorBidi"/>
       <w:color w:val="2E74B5"/>
       <w:sz w:val="32"/>
       <w:szCs w:val="32"/>
@@ -1180,6 +1247,7 @@
     <w:qFormat/>
     <w:uiPriority w:val="0"/>
     <w:rPr>
+      <w:rFonts w:asciiTheme="minorHAnsi" w:hAnsiTheme="minorHAnsi" w:eastAsiaTheme="minorEastAsia" w:cstheme="minorBidi"/>
       <w:color w:val="2E74B5"/>
       <w:sz w:val="26"/>
       <w:szCs w:val="26"/>
@@ -1191,6 +1259,7 @@
     <w:qFormat/>
     <w:uiPriority w:val="0"/>
     <w:rPr>
+      <w:rFonts w:asciiTheme="minorHAnsi" w:hAnsiTheme="minorHAnsi" w:eastAsiaTheme="minorEastAsia" w:cstheme="minorBidi"/>
       <w:color w:val="1F4D78"/>
       <w:sz w:val="24"/>
       <w:szCs w:val="24"/>
@@ -1202,6 +1271,7 @@
     <w:qFormat/>
     <w:uiPriority w:val="0"/>
     <w:rPr>
+      <w:rFonts w:asciiTheme="minorHAnsi" w:hAnsiTheme="minorHAnsi" w:eastAsiaTheme="minorEastAsia" w:cstheme="minorBidi"/>
       <w:i/>
       <w:iCs/>
       <w:color w:val="2E74B5"/>
@@ -1215,6 +1285,7 @@
     <w:qFormat/>
     <w:uiPriority w:val="0"/>
     <w:rPr>
+      <w:rFonts w:asciiTheme="minorHAnsi" w:hAnsiTheme="minorHAnsi" w:eastAsiaTheme="minorEastAsia" w:cstheme="minorBidi"/>
       <w:color w:val="2E74B5"/>
       <w:sz w:val="21"/>
       <w:szCs w:val="22"/>
@@ -1226,6 +1297,7 @@
     <w:qFormat/>
     <w:uiPriority w:val="0"/>
     <w:rPr>
+      <w:rFonts w:asciiTheme="minorHAnsi" w:hAnsiTheme="minorHAnsi" w:eastAsiaTheme="minorEastAsia" w:cstheme="minorBidi"/>
       <w:color w:val="1F4D78"/>
       <w:sz w:val="21"/>
       <w:szCs w:val="22"/>
@@ -1255,6 +1327,7 @@
     <w:name w:val="endnote reference"/>
     <w:semiHidden/>
     <w:unhideWhenUsed/>
+    <w:qFormat/>
     <w:uiPriority w:val="99"/>
     <w:rPr>
       <w:vertAlign w:val="superscript"/>
@@ -1265,11 +1338,13 @@
     <w:link w:val="18"/>
     <w:semiHidden/>
     <w:unhideWhenUsed/>
+    <w:qFormat/>
     <w:uiPriority w:val="99"/>
     <w:pPr>
       <w:spacing w:after="0" w:line="240" w:lineRule="auto"/>
     </w:pPr>
     <w:rPr>
+      <w:rFonts w:asciiTheme="minorHAnsi" w:hAnsiTheme="minorHAnsi" w:eastAsiaTheme="minorEastAsia" w:cstheme="minorBidi"/>
       <w:sz w:val="20"/>
       <w:szCs w:val="20"/>
     </w:rPr>
@@ -1295,6 +1370,7 @@
       <w:spacing w:after="0" w:line="240" w:lineRule="auto"/>
     </w:pPr>
     <w:rPr>
+      <w:rFonts w:asciiTheme="minorHAnsi" w:hAnsiTheme="minorHAnsi" w:eastAsiaTheme="minorEastAsia" w:cstheme="minorBidi"/>
       <w:sz w:val="20"/>
       <w:szCs w:val="20"/>
     </w:rPr>
@@ -1314,6 +1390,7 @@
     <w:qFormat/>
     <w:uiPriority w:val="0"/>
     <w:rPr>
+      <w:rFonts w:asciiTheme="minorHAnsi" w:hAnsiTheme="minorHAnsi" w:eastAsiaTheme="minorEastAsia" w:cstheme="minorBidi"/>
       <w:sz w:val="56"/>
       <w:szCs w:val="56"/>
     </w:rPr>
@@ -1323,6 +1400,7 @@
     <w:qFormat/>
     <w:uiPriority w:val="0"/>
     <w:rPr>
+      <w:rFonts w:asciiTheme="minorHAnsi" w:hAnsiTheme="minorHAnsi" w:eastAsiaTheme="minorEastAsia" w:cstheme="minorBidi"/>
       <w:sz w:val="21"/>
       <w:szCs w:val="22"/>
     </w:rPr>
@@ -1332,6 +1410,7 @@
     <w:link w:val="13"/>
     <w:semiHidden/>
     <w:unhideWhenUsed/>
+    <w:qFormat/>
     <w:uiPriority w:val="99"/>
     <w:rPr>
       <w:sz w:val="20"/>
@@ -1343,6 +1422,7 @@
     <w:link w:val="11"/>
     <w:semiHidden/>
     <w:unhideWhenUsed/>
+    <w:qFormat/>
     <w:uiPriority w:val="99"/>
     <w:rPr>
       <w:sz w:val="20"/>

</xml_diff>